<commit_message>
docs: add IEEE introduction and methodology article for RSL project
</commit_message>
<xml_diff>
--- a/project/Articulo_RSL_Introduccion_y_Metodologia_IEEE.docx
+++ b/project/Articulo_RSL_Introduccion_y_Metodologia_IEEE.docx
@@ -70,6 +70,13 @@
         </w:rPr>
         <w:br/>
         <w:t>Curso: Formación para la Investigación (2026-1) | Docente Asesor: Jimmy Sánchez Portugal</w:t>
+      </w:r>
+      <w:r>
+        <w:rPr>
+          <w:i/>
+          <w:sz w:val="19"/>
+        </w:rPr>
+        <w:t xml:space="preserve"> </w:t>
       </w:r>
     </w:p>
     <w:p>

</xml_diff>